<commit_message>
Publico-alvo generico: postos fixos ou setores de solda pequenos
Remove a citacao da Marcopolo (sem parceria formal) do README, das telas e
do PDF mensal. Camera a 2-6 m (testado ate 4 m). Posto de validacao na
entrada do setor fica citado so como ideia futura, por sugestao do professor.

Co-Authored-By: Claude Opus 5.5 <noreply@anthropic.com>
</commit_message>
<xml_diff>
--- a/docs/academico/relatorio_fsg.docx
+++ b/docs/academico/relatorio_fsg.docx
@@ -730,7 +730,7 @@
         <w:rPr>
           <w:rFonts w:ascii="Times New Roman" w:hAnsi="Times New Roman" w:cs="Times New Roman"/>
         </w:rPr>
-        <w:t xml:space="preserve"> A câmera fica fixa na frente do posto de solda, a cerca de 2 a 3 m e 1,6 a 2 m de altura, fora da linha direta do arco; o soldador, que naturalmente trabalha de frente para a peça, não precisa mudar a rotina. O sistema processa a câmera em tempo real, no computador do setor. Durante o turno, o supervisor acompanha pela tela “Ao vivo” (no computador ou no celular). No fim do turno, confere as ocorrências e marca cada uma como confirmada ou falso positivo. No mês, usa o painel e o relatório em PDF para ver em que posto e turno a máscara mais falta e conversar com a equipe no diálogo de segurança.</w:t>
+        <w:t xml:space="preserve"> A câmera fica fixa na frente do posto de solda, a curta distância (2 a 6 m; testado até 4 m) e 1,6 a 2 m de altura, fora da linha direta do arco; o soldador, que naturalmente trabalha de frente para a peça, não precisa mudar a rotina. O sistema processa a câmera em tempo real, no computador do setor. Durante o turno, o supervisor acompanha pela tela “Ao vivo” (no computador ou no celular). No fim do turno, confere as ocorrências e marca cada uma como confirmada ou falso positivo. No mês, usa o painel e o relatório em PDF para ver em que posto e turno a máscara mais falta e conversar com a equipe no diálogo de segurança.</w:t>
       </w:r>
     </w:p>
     <w:p>
@@ -740,9 +740,22 @@
       <w:r>
         <w:rPr>
           <w:rFonts w:ascii="Times New Roman" w:hAnsi="Times New Roman" w:cs="Times New Roman"/>
+          <w:b/>
+        </w:rPr>
+        <w:t xml:space="preserve">Público-alvo.</w:t>
+      </w:r>
+      <w:r>
+        <w:rPr>
+          <w:rFonts w:ascii="Times New Roman" w:hAnsi="Times New Roman" w:cs="Times New Roman"/>
+        </w:rPr>
+        <w:t xml:space="preserve"> O sistema foi pensado para empresas que têm postos fixos de solda (cabine, bancada ou célula) ou setores de solda pequenos, em que a câmera pode ficar perto do soldador. Não foi escolhida uma empresa específica: o cenário é genérico, conforme combinado com o professor da disciplina. </w:t>
+      </w:r>
+      <w:r>
+        <w:rPr>
+          <w:rFonts w:ascii="Times New Roman" w:hAnsi="Times New Roman" w:cs="Times New Roman"/>
           <w:highlight w:val="yellow"/>
         </w:rPr>
-        <w:t xml:space="preserve">[PREENCHER: empresa e posto escolhidos como cenário (ex.: bancada fixa de solda MIG/MAG de subconjuntos da estrutura de carrocerias de ônibus da Marcopolo), com data e resultado da visita/conversa com a empresa. Se não houve vínculo formal, escrever “cenário de referência”.]</w:t>
+        <w:t xml:space="preserve">[PREENCHER: contato ou conversa com alguma empresa ou escola, se houver, com data.]</w:t>
       </w:r>
     </w:p>
     <w:p>
@@ -2178,7 +2191,7 @@
         <w:rPr>
           <w:rFonts w:ascii="Times New Roman" w:hAnsi="Times New Roman" w:cs="Times New Roman"/>
         </w:rPr>
-        <w:t xml:space="preserve">Como pontos de melhoria, sugerem-se: um piloto de algumas semanas em um posto real, com o ajuste fino do modelo com imagens do próprio posto (máscara abaixada e levantada de vários ângulos); a calibração dos limites do arco; a inclusão dos demais EPIs (luvas, avental, calçado) com dados próprios; e a avaliação com mais câmeras e por mais tempo, com grupo de comparação.</w:t>
+        <w:t xml:space="preserve">Como pontos de melhoria, sugerem-se: um piloto de algumas semanas em um posto real, com o ajuste fino do modelo com imagens do próprio posto (máscara abaixada e levantada de vários ângulos); a calibração dos limites do arco; a inclusão dos demais EPIs (luvas, avental, calçado) com dados próprios; a avaliação com mais câmeras e por mais tempo, com grupo de comparação; e, como ideia para o futuro, um posto de validação na entrada do setor, que confere a máscara antes de a pessoa começar a soldar, sem acompanhar o turno inteiro.</w:t>
       </w:r>
     </w:p>
     <w:p/>

</xml_diff>